<commit_message>
Aufgaben Logische Operatoren and Lerndokumentation
</commit_message>
<xml_diff>
--- a/Lerndokumentation/Lerndokumentation Jony.docx
+++ b/Lerndokumentation/Lerndokumentation Jony.docx
@@ -1,6 +1,6 @@
 
 <file path=word/document.xml><?xml version="1.0" encoding="utf-8"?>
-<w:document xmlns:wpc="http://schemas.microsoft.com/office/word/2010/wordprocessingCanvas" xmlns:cx="http://schemas.microsoft.com/office/drawing/2014/chartex" xmlns:cx1="http://schemas.microsoft.com/office/drawing/2015/9/8/chartex" xmlns:cx2="http://schemas.microsoft.com/office/drawing/2015/10/21/chartex" xmlns:cx3="http://schemas.microsoft.com/office/drawing/2016/5/9/chartex" xmlns:cx4="http://schemas.microsoft.com/office/drawing/2016/5/10/chartex" xmlns:cx5="http://schemas.microsoft.com/office/drawing/2016/5/11/chartex" xmlns:cx6="http://schemas.microsoft.com/office/drawing/2016/5/12/chartex" xmlns:cx7="http://schemas.microsoft.com/office/drawing/2016/5/13/chartex" xmlns:cx8="http://schemas.microsoft.com/office/drawing/2016/5/14/chartex" xmlns:mc="http://schemas.openxmlformats.org/markup-compatibility/2006" xmlns:aink="http://schemas.microsoft.com/office/drawing/2016/ink" xmlns:am3d="http://schemas.microsoft.com/office/drawing/2017/model3d" xmlns:o="urn:schemas-microsoft-com:office:office" xmlns:oel="http://schemas.microsoft.com/office/2019/extlst" xmlns:r="http://schemas.openxmlformats.org/officeDocument/2006/relationships" xmlns:m="http://schemas.openxmlformats.org/officeDocument/2006/math" xmlns:v="urn:schemas-microsoft-com:vml" xmlns:wp14="http://schemas.microsoft.com/office/word/2010/wordprocessingDrawing" xmlns:wp="http://schemas.openxmlformats.org/drawingml/2006/wordprocessingDrawing" xmlns:w10="urn:schemas-microsoft-com:office:word" xmlns:w="http://schemas.openxmlformats.org/wordprocessingml/2006/main" xmlns:w14="http://schemas.microsoft.com/office/word/2010/wordml" xmlns:w15="http://schemas.microsoft.com/office/word/2012/wordml" xmlns:w16cex="http://schemas.microsoft.com/office/word/2018/wordml/cex" xmlns:w16cid="http://schemas.microsoft.com/office/word/2016/wordml/cid" xmlns:w16="http://schemas.microsoft.com/office/word/2018/wordml" xmlns:w16du="http://schemas.microsoft.com/office/word/2023/wordml/word16du" xmlns:w16sdtdh="http://schemas.microsoft.com/office/word/2020/wordml/sdtdatahash" xmlns:w16sdtfl="http://schemas.microsoft.com/office/word/2024/wordml/sdtformatlock" xmlns:w16se="http://schemas.microsoft.com/office/word/2015/wordml/symex" xmlns:wpg="http://schemas.microsoft.com/office/word/2010/wordprocessingGroup" xmlns:wpi="http://schemas.microsoft.com/office/word/2010/wordprocessingInk" xmlns:wne="http://schemas.microsoft.com/office/word/2006/wordml" xmlns:wps="http://schemas.microsoft.com/office/word/2010/wordprocessingShape" xmlns:a="http://schemas.openxmlformats.org/drawingml/2006/main" xmlns:pic="http://schemas.openxmlformats.org/drawingml/2006/picture" xmlns:a14="http://schemas.microsoft.com/office/drawing/2010/main" mc:Ignorable="w14 w15 w16se w16cid w16 w16cex w16sdtdh w16sdtfl w16du wp14">
+<w:document xmlns:wpc="http://schemas.microsoft.com/office/word/2010/wordprocessingCanvas" xmlns:cx="http://schemas.microsoft.com/office/drawing/2014/chartex" xmlns:cx1="http://schemas.microsoft.com/office/drawing/2015/9/8/chartex" xmlns:cx2="http://schemas.microsoft.com/office/drawing/2015/10/21/chartex" xmlns:cx3="http://schemas.microsoft.com/office/drawing/2016/5/9/chartex" xmlns:cx4="http://schemas.microsoft.com/office/drawing/2016/5/10/chartex" xmlns:cx5="http://schemas.microsoft.com/office/drawing/2016/5/11/chartex" xmlns:cx6="http://schemas.microsoft.com/office/drawing/2016/5/12/chartex" xmlns:cx7="http://schemas.microsoft.com/office/drawing/2016/5/13/chartex" xmlns:cx8="http://schemas.microsoft.com/office/drawing/2016/5/14/chartex" xmlns:mc="http://schemas.openxmlformats.org/markup-compatibility/2006" xmlns:aink="http://schemas.microsoft.com/office/drawing/2016/ink" xmlns:am3d="http://schemas.microsoft.com/office/drawing/2017/model3d" xmlns:o="urn:schemas-microsoft-com:office:office" xmlns:oel="http://schemas.microsoft.com/office/2019/extlst" xmlns:r="http://schemas.openxmlformats.org/officeDocument/2006/relationships" xmlns:m="http://schemas.openxmlformats.org/officeDocument/2006/math" xmlns:v="urn:schemas-microsoft-com:vml" xmlns:wp14="http://schemas.microsoft.com/office/word/2010/wordprocessingDrawing" xmlns:wp="http://schemas.openxmlformats.org/drawingml/2006/wordprocessingDrawing" xmlns:w10="urn:schemas-microsoft-com:office:word" xmlns:w="http://schemas.openxmlformats.org/wordprocessingml/2006/main" xmlns:w14="http://schemas.microsoft.com/office/word/2010/wordml" xmlns:w15="http://schemas.microsoft.com/office/word/2012/wordml" xmlns:w16cex="http://schemas.microsoft.com/office/word/2018/wordml/cex" xmlns:w16cid="http://schemas.microsoft.com/office/word/2016/wordml/cid" xmlns:w16="http://schemas.microsoft.com/office/word/2018/wordml" xmlns:w16du="http://schemas.microsoft.com/office/word/2023/wordml/word16du" xmlns:w16sdtdh="http://schemas.microsoft.com/office/word/2020/wordml/sdtdatahash" xmlns:w16sdtfl="http://schemas.microsoft.com/office/word/2024/wordml/sdtformatlock" xmlns:w16se="http://schemas.microsoft.com/office/word/2015/wordml/symex" xmlns:wpg="http://schemas.microsoft.com/office/word/2010/wordprocessingGroup" xmlns:wpi="http://schemas.microsoft.com/office/word/2010/wordprocessingInk" xmlns:wne="http://schemas.microsoft.com/office/word/2006/wordml" xmlns:wps="http://schemas.microsoft.com/office/word/2010/wordprocessingShape" mc:Ignorable="w14 w15 w16se w16cid w16 w16cex w16sdtdh w16sdtfl w16du wp14">
   <w:body>
     <w:p>
       <w:pPr>
@@ -139,8 +139,8 @@
       <w:pPr>
         <w:jc w:val="center"/>
         <w:rPr>
-          <w:b w:val="1"/>
-          <w:bCs w:val="1"/>
+          <w:b/>
+          <w:bCs/>
           <w:sz w:val="44"/>
           <w:szCs w:val="44"/>
         </w:rPr>
@@ -150,13 +150,13 @@
           <w:noProof/>
         </w:rPr>
         <w:drawing>
-          <wp:anchor distT="0" distB="0" distL="114300" distR="114300" simplePos="0" relativeHeight="251658242" behindDoc="0" locked="0" layoutInCell="1" allowOverlap="1" wp14:anchorId="77CABFCF" wp14:editId="3CABF28F">
+          <wp:anchor distT="0" distB="0" distL="114300" distR="114300" simplePos="0" relativeHeight="251658242" behindDoc="0" locked="0" layoutInCell="1" allowOverlap="1" wp14:anchorId="77CABFCF" wp14:editId="2388D14D">
             <wp:simplePos x="0" y="0"/>
-            <wp:positionH relativeFrom="column">
-              <wp:posOffset>-904875</wp:posOffset>
+            <wp:positionH relativeFrom="margin">
+              <wp:align>center</wp:align>
             </wp:positionH>
             <wp:positionV relativeFrom="paragraph">
-              <wp:posOffset>238125</wp:posOffset>
+              <wp:posOffset>244475</wp:posOffset>
             </wp:positionV>
             <wp:extent cx="8524949" cy="4795284"/>
             <wp:effectExtent l="0" t="0" r="0" b="0"/>
@@ -166,7 +166,7 @@
               <a:graphicFrameLocks xmlns:a="http://schemas.openxmlformats.org/drawingml/2006/main" noChangeAspect="1"/>
             </wp:cNvGraphicFramePr>
             <a:graphic xmlns:a="http://schemas.openxmlformats.org/drawingml/2006/main">
-              <a:graphicData xmlns:a="http://schemas.openxmlformats.org/drawingml/2006/main" uri="http://schemas.openxmlformats.org/drawingml/2006/picture">
+              <a:graphicData uri="http://schemas.openxmlformats.org/drawingml/2006/picture">
                 <pic:pic xmlns:pic="http://schemas.openxmlformats.org/drawingml/2006/picture">
                   <pic:nvPicPr>
                     <pic:cNvPr id="0" name="Picture 1" descr="Java Logo and symbol, meaning, history, sign."/>
@@ -175,7 +175,7 @@
                     </pic:cNvPicPr>
                   </pic:nvPicPr>
                   <pic:blipFill>
-                    <a:blip xmlns:r="http://schemas.openxmlformats.org/officeDocument/2006/relationships" r:embed="rId8" cstate="print">
+                    <a:blip r:embed="rId8" cstate="print">
                       <a:extLst>
                         <a:ext uri="{28A0092B-C50C-407E-A947-70E740481C1C}">
                           <a14:useLocalDpi xmlns:a14="http://schemas.microsoft.com/office/drawing/2010/main" val="0"/>
@@ -325,13 +325,8 @@
     </w:p>
     <w:sdt>
       <w:sdtPr>
-        <w:id w:val="-1418942804"/>
-        <w:docPartObj>
-          <w:docPartGallery w:val="Table of Contents"/>
-          <w:docPartUnique/>
-        </w:docPartObj>
         <w:rPr>
-          <w:rFonts w:ascii="Aptos" w:hAnsi="Aptos" w:eastAsia="" w:cs="" w:asciiTheme="minorAscii" w:hAnsiTheme="minorAscii" w:eastAsiaTheme="minorEastAsia" w:cstheme="minorBidi"/>
+          <w:rFonts w:asciiTheme="minorHAnsi" w:eastAsiaTheme="minorEastAsia" w:hAnsiTheme="minorHAnsi" w:cstheme="minorBidi"/>
           <w:color w:val="auto"/>
           <w:kern w:val="2"/>
           <w:sz w:val="24"/>
@@ -339,22 +334,22 @@
           <w:lang w:val="de-DE" w:eastAsia="en-US"/>
           <w14:ligatures w14:val="standardContextual"/>
         </w:rPr>
+        <w:id w:val="-1418942804"/>
+        <w:docPartObj>
+          <w:docPartGallery w:val="Table of Contents"/>
+          <w:docPartUnique/>
+        </w:docPartObj>
       </w:sdtPr>
       <w:sdtEndPr>
         <w:rPr>
-          <w:rFonts w:ascii="Aptos" w:hAnsi="Aptos" w:eastAsia="" w:cs="" w:asciiTheme="minorAscii" w:hAnsiTheme="minorAscii" w:eastAsiaTheme="minorEastAsia" w:cstheme="minorBidi"/>
-          <w:b w:val="1"/>
-          <w:bCs w:val="1"/>
-          <w:color w:val="auto"/>
-          <w:sz w:val="24"/>
-          <w:szCs w:val="24"/>
-          <w:lang w:val="de-DE" w:eastAsia="en-US"/>
+          <w:b/>
+          <w:bCs/>
         </w:rPr>
       </w:sdtEndPr>
       <w:sdtContent>
         <w:p>
           <w:pPr>
-            <w:pStyle w:val="TOCHeading"/>
+            <w:pStyle w:val="Inhaltsverzeichnisberschrift"/>
           </w:pPr>
           <w:r>
             <w:rPr>
@@ -365,7 +360,7 @@
         </w:p>
         <w:p>
           <w:pPr>
-            <w:pStyle w:val="TOC1"/>
+            <w:pStyle w:val="Verzeichnis1"/>
             <w:tabs>
               <w:tab w:val="right" w:leader="dot" w:pos="9062"/>
             </w:tabs>
@@ -384,7 +379,7 @@
           <w:r>
             <w:fldChar w:fldCharType="separate"/>
           </w:r>
-          <w:hyperlink w:history="1" w:anchor="_Toc241693213">
+          <w:hyperlink w:anchor="_Toc244078657" w:history="1">
             <w:r>
               <w:rPr>
                 <w:rStyle w:val="Hyperlink"/>
@@ -411,7 +406,7 @@
                 <w:noProof/>
                 <w:webHidden/>
               </w:rPr>
-              <w:instrText xml:space="preserve"> PAGEREF _Toc241693213 \h </w:instrText>
+              <w:instrText xml:space="preserve"> PAGEREF _Toc244078657 \h </w:instrText>
             </w:r>
             <w:r>
               <w:rPr>
@@ -444,7 +439,7 @@
         </w:p>
         <w:p>
           <w:pPr>
-            <w:pStyle w:val="TOC1"/>
+            <w:pStyle w:val="Verzeichnis1"/>
             <w:tabs>
               <w:tab w:val="right" w:leader="dot" w:pos="9062"/>
             </w:tabs>
@@ -454,7 +449,7 @@
               <w:lang w:eastAsia="de-CH"/>
             </w:rPr>
           </w:pPr>
-          <w:hyperlink w:history="1" w:anchor="_Toc241693214">
+          <w:hyperlink w:anchor="_Toc244078658" w:history="1">
             <w:r>
               <w:rPr>
                 <w:rStyle w:val="Hyperlink"/>
@@ -481,7 +476,7 @@
                 <w:noProof/>
                 <w:webHidden/>
               </w:rPr>
-              <w:instrText xml:space="preserve"> PAGEREF _Toc241693214 \h </w:instrText>
+              <w:instrText xml:space="preserve"> PAGEREF _Toc244078658 \h </w:instrText>
             </w:r>
             <w:r>
               <w:rPr>
@@ -514,7 +509,7 @@
         </w:p>
         <w:p>
           <w:pPr>
-            <w:pStyle w:val="TOC2"/>
+            <w:pStyle w:val="Verzeichnis2"/>
             <w:tabs>
               <w:tab w:val="right" w:leader="dot" w:pos="9062"/>
             </w:tabs>
@@ -524,7 +519,7 @@
               <w:lang w:eastAsia="de-CH"/>
             </w:rPr>
           </w:pPr>
-          <w:hyperlink w:history="1" w:anchor="_Toc241693215">
+          <w:hyperlink w:anchor="_Toc244078659" w:history="1">
             <w:r>
               <w:rPr>
                 <w:rStyle w:val="Hyperlink"/>
@@ -551,7 +546,7 @@
                 <w:noProof/>
                 <w:webHidden/>
               </w:rPr>
-              <w:instrText xml:space="preserve"> PAGEREF _Toc241693215 \h </w:instrText>
+              <w:instrText xml:space="preserve"> PAGEREF _Toc244078659 \h </w:instrText>
             </w:r>
             <w:r>
               <w:rPr>
@@ -584,7 +579,7 @@
         </w:p>
         <w:p>
           <w:pPr>
-            <w:pStyle w:val="TOC1"/>
+            <w:pStyle w:val="Verzeichnis1"/>
             <w:tabs>
               <w:tab w:val="right" w:leader="dot" w:pos="9062"/>
             </w:tabs>
@@ -594,7 +589,7 @@
               <w:lang w:eastAsia="de-CH"/>
             </w:rPr>
           </w:pPr>
-          <w:hyperlink w:history="1" w:anchor="_Toc241693216">
+          <w:hyperlink w:anchor="_Toc244078660" w:history="1">
             <w:r>
               <w:rPr>
                 <w:rStyle w:val="Hyperlink"/>
@@ -621,7 +616,7 @@
                 <w:noProof/>
                 <w:webHidden/>
               </w:rPr>
-              <w:instrText xml:space="preserve"> PAGEREF _Toc241693216 \h </w:instrText>
+              <w:instrText xml:space="preserve"> PAGEREF _Toc244078660 \h </w:instrText>
             </w:r>
             <w:r>
               <w:rPr>
@@ -654,7 +649,7 @@
         </w:p>
         <w:p>
           <w:pPr>
-            <w:pStyle w:val="TOC1"/>
+            <w:pStyle w:val="Verzeichnis1"/>
             <w:tabs>
               <w:tab w:val="right" w:leader="dot" w:pos="9062"/>
             </w:tabs>
@@ -664,7 +659,7 @@
               <w:lang w:eastAsia="de-CH"/>
             </w:rPr>
           </w:pPr>
-          <w:hyperlink w:history="1" w:anchor="_Toc241693217">
+          <w:hyperlink w:anchor="_Toc244078661" w:history="1">
             <w:r>
               <w:rPr>
                 <w:rStyle w:val="Hyperlink"/>
@@ -691,7 +686,7 @@
                 <w:noProof/>
                 <w:webHidden/>
               </w:rPr>
-              <w:instrText xml:space="preserve"> PAGEREF _Toc241693217 \h </w:instrText>
+              <w:instrText xml:space="preserve"> PAGEREF _Toc244078661 \h </w:instrText>
             </w:r>
             <w:r>
               <w:rPr>
@@ -724,7 +719,7 @@
         </w:p>
         <w:p>
           <w:pPr>
-            <w:pStyle w:val="TOC2"/>
+            <w:pStyle w:val="Verzeichnis2"/>
             <w:tabs>
               <w:tab w:val="right" w:leader="dot" w:pos="9062"/>
             </w:tabs>
@@ -734,7 +729,7 @@
               <w:lang w:eastAsia="de-CH"/>
             </w:rPr>
           </w:pPr>
-          <w:hyperlink w:history="1" w:anchor="_Toc241693218">
+          <w:hyperlink w:anchor="_Toc244078662" w:history="1">
             <w:r>
               <w:rPr>
                 <w:rStyle w:val="Hyperlink"/>
@@ -761,7 +756,7 @@
                 <w:noProof/>
                 <w:webHidden/>
               </w:rPr>
-              <w:instrText xml:space="preserve"> PAGEREF _Toc241693218 \h </w:instrText>
+              <w:instrText xml:space="preserve"> PAGEREF _Toc244078662 \h </w:instrText>
             </w:r>
             <w:r>
               <w:rPr>
@@ -794,7 +789,7 @@
         </w:p>
         <w:p>
           <w:pPr>
-            <w:pStyle w:val="TOC1"/>
+            <w:pStyle w:val="Verzeichnis1"/>
             <w:tabs>
               <w:tab w:val="right" w:leader="dot" w:pos="9062"/>
             </w:tabs>
@@ -804,7 +799,7 @@
               <w:lang w:eastAsia="de-CH"/>
             </w:rPr>
           </w:pPr>
-          <w:hyperlink w:history="1" w:anchor="_Toc241693219">
+          <w:hyperlink w:anchor="_Toc244078663" w:history="1">
             <w:r>
               <w:rPr>
                 <w:rStyle w:val="Hyperlink"/>
@@ -831,7 +826,7 @@
                 <w:noProof/>
                 <w:webHidden/>
               </w:rPr>
-              <w:instrText xml:space="preserve"> PAGEREF _Toc241693219 \h </w:instrText>
+              <w:instrText xml:space="preserve"> PAGEREF _Toc244078663 \h </w:instrText>
             </w:r>
             <w:r>
               <w:rPr>
@@ -864,7 +859,7 @@
         </w:p>
         <w:p>
           <w:pPr>
-            <w:pStyle w:val="TOC1"/>
+            <w:pStyle w:val="Verzeichnis1"/>
             <w:tabs>
               <w:tab w:val="right" w:leader="dot" w:pos="9062"/>
             </w:tabs>
@@ -874,7 +869,7 @@
               <w:lang w:eastAsia="de-CH"/>
             </w:rPr>
           </w:pPr>
-          <w:hyperlink w:history="1" w:anchor="_Toc241693220">
+          <w:hyperlink w:anchor="_Toc244078664" w:history="1">
             <w:r>
               <w:rPr>
                 <w:rStyle w:val="Hyperlink"/>
@@ -901,7 +896,7 @@
                 <w:noProof/>
                 <w:webHidden/>
               </w:rPr>
-              <w:instrText xml:space="preserve"> PAGEREF _Toc241693220 \h </w:instrText>
+              <w:instrText xml:space="preserve"> PAGEREF _Toc244078664 \h </w:instrText>
             </w:r>
             <w:r>
               <w:rPr>
@@ -934,7 +929,7 @@
         </w:p>
         <w:p>
           <w:pPr>
-            <w:pStyle w:val="TOC1"/>
+            <w:pStyle w:val="Verzeichnis1"/>
             <w:tabs>
               <w:tab w:val="right" w:leader="dot" w:pos="9062"/>
             </w:tabs>
@@ -944,7 +939,7 @@
               <w:lang w:eastAsia="de-CH"/>
             </w:rPr>
           </w:pPr>
-          <w:hyperlink w:history="1" w:anchor="_Toc241693221">
+          <w:hyperlink w:anchor="_Toc244078665" w:history="1">
             <w:r>
               <w:rPr>
                 <w:rStyle w:val="Hyperlink"/>
@@ -971,7 +966,7 @@
                 <w:noProof/>
                 <w:webHidden/>
               </w:rPr>
-              <w:instrText xml:space="preserve"> PAGEREF _Toc241693221 \h </w:instrText>
+              <w:instrText xml:space="preserve"> PAGEREF _Toc244078665 \h </w:instrText>
             </w:r>
             <w:r>
               <w:rPr>
@@ -992,6 +987,146 @@
                 <w:webHidden/>
               </w:rPr>
               <w:t>5</w:t>
+            </w:r>
+            <w:r>
+              <w:rPr>
+                <w:noProof/>
+                <w:webHidden/>
+              </w:rPr>
+              <w:fldChar w:fldCharType="end"/>
+            </w:r>
+          </w:hyperlink>
+        </w:p>
+        <w:p>
+          <w:pPr>
+            <w:pStyle w:val="Verzeichnis1"/>
+            <w:tabs>
+              <w:tab w:val="right" w:leader="dot" w:pos="9062"/>
+            </w:tabs>
+            <w:rPr>
+              <w:rFonts w:eastAsiaTheme="minorEastAsia"/>
+              <w:noProof/>
+              <w:lang w:eastAsia="de-CH"/>
+            </w:rPr>
+          </w:pPr>
+          <w:hyperlink w:anchor="_Toc244078666" w:history="1">
+            <w:r>
+              <w:rPr>
+                <w:rStyle w:val="Hyperlink"/>
+                <w:noProof/>
+              </w:rPr>
+              <w:t>07.10.2026 Logische Operatoren &amp; Logikgatter</w:t>
+            </w:r>
+            <w:r>
+              <w:rPr>
+                <w:noProof/>
+                <w:webHidden/>
+              </w:rPr>
+              <w:tab/>
+            </w:r>
+            <w:r>
+              <w:rPr>
+                <w:noProof/>
+                <w:webHidden/>
+              </w:rPr>
+              <w:fldChar w:fldCharType="begin"/>
+            </w:r>
+            <w:r>
+              <w:rPr>
+                <w:noProof/>
+                <w:webHidden/>
+              </w:rPr>
+              <w:instrText xml:space="preserve"> PAGEREF _Toc244078666 \h </w:instrText>
+            </w:r>
+            <w:r>
+              <w:rPr>
+                <w:noProof/>
+                <w:webHidden/>
+              </w:rPr>
+            </w:r>
+            <w:r>
+              <w:rPr>
+                <w:noProof/>
+                <w:webHidden/>
+              </w:rPr>
+              <w:fldChar w:fldCharType="separate"/>
+            </w:r>
+            <w:r>
+              <w:rPr>
+                <w:noProof/>
+                <w:webHidden/>
+              </w:rPr>
+              <w:t>6</w:t>
+            </w:r>
+            <w:r>
+              <w:rPr>
+                <w:noProof/>
+                <w:webHidden/>
+              </w:rPr>
+              <w:fldChar w:fldCharType="end"/>
+            </w:r>
+          </w:hyperlink>
+        </w:p>
+        <w:p>
+          <w:pPr>
+            <w:pStyle w:val="Verzeichnis1"/>
+            <w:tabs>
+              <w:tab w:val="right" w:leader="dot" w:pos="9062"/>
+            </w:tabs>
+            <w:rPr>
+              <w:rFonts w:eastAsiaTheme="minorEastAsia"/>
+              <w:noProof/>
+              <w:lang w:eastAsia="de-CH"/>
+            </w:rPr>
+          </w:pPr>
+          <w:hyperlink w:anchor="_Toc244078667" w:history="1">
+            <w:r>
+              <w:rPr>
+                <w:rStyle w:val="Hyperlink"/>
+                <w:noProof/>
+              </w:rPr>
+              <w:t>28.10.2026 Aufgaben Logische Operatoren</w:t>
+            </w:r>
+            <w:r>
+              <w:rPr>
+                <w:noProof/>
+                <w:webHidden/>
+              </w:rPr>
+              <w:tab/>
+            </w:r>
+            <w:r>
+              <w:rPr>
+                <w:noProof/>
+                <w:webHidden/>
+              </w:rPr>
+              <w:fldChar w:fldCharType="begin"/>
+            </w:r>
+            <w:r>
+              <w:rPr>
+                <w:noProof/>
+                <w:webHidden/>
+              </w:rPr>
+              <w:instrText xml:space="preserve"> PAGEREF _Toc244078667 \h </w:instrText>
+            </w:r>
+            <w:r>
+              <w:rPr>
+                <w:noProof/>
+                <w:webHidden/>
+              </w:rPr>
+            </w:r>
+            <w:r>
+              <w:rPr>
+                <w:noProof/>
+                <w:webHidden/>
+              </w:rPr>
+              <w:fldChar w:fldCharType="separate"/>
+            </w:r>
+            <w:r>
+              <w:rPr>
+                <w:noProof/>
+                <w:webHidden/>
+              </w:rPr>
+              <w:t>6</w:t>
             </w:r>
             <w:r>
               <w:rPr>
@@ -1027,9 +1162,9 @@
     </w:p>
     <w:p>
       <w:pPr>
-        <w:pStyle w:val="Heading1"/>
-      </w:pPr>
-      <w:bookmarkStart w:name="_Toc241693213" w:id="0"/>
+        <w:pStyle w:val="berschrift1"/>
+      </w:pPr>
+      <w:bookmarkStart w:id="0" w:name="_Toc244078657"/>
       <w:r>
         <w:t>19.08.2026 Erstes Mal Java</w:t>
       </w:r>
@@ -1071,7 +1206,7 @@
           <w:noProof/>
         </w:rPr>
         <w:drawing>
-          <wp:anchor distT="0" distB="0" distL="114300" distR="114300" simplePos="0" relativeHeight="251658241" behindDoc="0" locked="0" layoutInCell="1" allowOverlap="1" wp14:anchorId="4AB68045" wp14:editId="7A985FD8">
+          <wp:anchor distT="0" distB="0" distL="114300" distR="114300" simplePos="0" relativeHeight="251658241" behindDoc="0" locked="0" layoutInCell="1" allowOverlap="1" wp14:anchorId="4AB68045" wp14:editId="6357633C">
             <wp:simplePos x="0" y="0"/>
             <wp:positionH relativeFrom="column">
               <wp:posOffset>2853055</wp:posOffset>
@@ -1184,9 +1319,9 @@
     <w:p/>
     <w:p>
       <w:pPr>
-        <w:pStyle w:val="Heading1"/>
-      </w:pPr>
-      <w:bookmarkStart w:name="_Toc241693214" w:id="1"/>
+        <w:pStyle w:val="berschrift1"/>
+      </w:pPr>
+      <w:bookmarkStart w:id="1" w:name="_Toc244078658"/>
       <w:r>
         <w:t xml:space="preserve">26.08.2026 </w:t>
       </w:r>
@@ -1287,9 +1422,9 @@
     <w:p/>
     <w:p>
       <w:pPr>
-        <w:pStyle w:val="Heading2"/>
-      </w:pPr>
-      <w:bookmarkStart w:name="_Toc241693215" w:id="2"/>
+        <w:pStyle w:val="berschrift2"/>
+      </w:pPr>
+      <w:bookmarkStart w:id="2" w:name="_Toc244078659"/>
       <w:r>
         <w:t>Strings</w:t>
       </w:r>
@@ -1319,9 +1454,9 @@
     <w:p/>
     <w:p>
       <w:pPr>
-        <w:pStyle w:val="Heading1"/>
-      </w:pPr>
-      <w:bookmarkStart w:name="_Toc241693216" w:id="3"/>
+        <w:pStyle w:val="berschrift1"/>
+      </w:pPr>
+      <w:bookmarkStart w:id="3" w:name="_Toc244078660"/>
       <w:r>
         <w:t>02.09.2026 Operatoren</w:t>
       </w:r>
@@ -1334,7 +1469,11 @@
     </w:p>
     <w:p>
       <w:r>
-        <w:t>Danach ging es um Zuweisungsoperatoren wie += oder -=, die einem viel Schreibarbeit ersparen, wenn man Werte schrittweise erhöhen oder verringern möchte. Am Schluss haben wir noch unäre Operatoren angeschaut, wie zum Beispiel ++ und -- zum Hoch- oder Runterzählen sowie den Rufzeichen-Operator !, der Wahrheitswerte einfach umkehrt. Das Thema war recht umfangreich, aber durch die vielen Beispiele hat man den Sinn hinter den Zeichen schnell verstanden.</w:t>
+        <w:t xml:space="preserve">Danach ging es um Zuweisungsoperatoren wie += oder -=, die einem viel Schreibarbeit ersparen, wenn man Werte schrittweise erhöhen oder verringern möchte. Am Schluss </w:t>
+      </w:r>
+      <w:r>
+        <w:lastRenderedPageBreak/>
+        <w:t>haben wir noch unäre Operatoren angeschaut, wie zum Beispiel ++ und -- zum Hoch- oder Runterzählen sowie den Rufzeichen-Operator !, der Wahrheitswerte einfach umkehrt. Das Thema war recht umfangreich, aber durch die vielen Beispiele hat man den Sinn hinter den Zeichen schnell verstanden.</w:t>
       </w:r>
     </w:p>
     <w:p/>
@@ -1342,9 +1481,9 @@
     <w:p/>
     <w:p>
       <w:pPr>
-        <w:pStyle w:val="Heading1"/>
-      </w:pPr>
-      <w:bookmarkStart w:name="_Toc241693217" w:id="4"/>
+        <w:pStyle w:val="berschrift1"/>
+      </w:pPr>
+      <w:bookmarkStart w:id="4" w:name="_Toc244078661"/>
       <w:r>
         <w:t>09.09.2026 Benutzereingabe</w:t>
       </w:r>
@@ -1413,9 +1552,9 @@
     </w:p>
     <w:p>
       <w:pPr>
-        <w:pStyle w:val="Heading2"/>
-      </w:pPr>
-      <w:bookmarkStart w:name="_Toc241693218" w:id="5"/>
+        <w:pStyle w:val="berschrift2"/>
+      </w:pPr>
+      <w:bookmarkStart w:id="5" w:name="_Toc244078662"/>
       <w:r>
         <w:t>Type Casting</w:t>
       </w:r>
@@ -1484,9 +1623,9 @@
     </w:p>
     <w:p>
       <w:pPr>
-        <w:pStyle w:val="Heading1"/>
-      </w:pPr>
-      <w:bookmarkStart w:name="_Toc241693219" w:id="6"/>
+        <w:pStyle w:val="berschrift1"/>
+      </w:pPr>
+      <w:bookmarkStart w:id="6" w:name="_Toc244078663"/>
       <w:r>
         <w:t>16.09.2026 Verzweigungen</w:t>
       </w:r>
@@ -1542,7 +1681,11 @@
       </w:r>
       <w:proofErr w:type="spellEnd"/>
       <w:r>
-        <w:t xml:space="preserve"> Abfragen den Fall, der am wahrscheinlichsten eintrifft, immer an die erste Stelle zu setzen, damit das Programm nicht unnötig viele Bedingungen prüfen muss. Ausserdem haben wir die Kurzform von </w:t>
+        <w:t xml:space="preserve"> Abfragen den Fall, der am wahrscheinlichsten eintrifft, immer an die erste Stelle zu </w:t>
+      </w:r>
+      <w:r>
+        <w:lastRenderedPageBreak/>
+        <w:t xml:space="preserve">setzen, damit das Programm nicht unnötig viele Bedingungen prüfen muss. Ausserdem haben wir die Kurzform von </w:t>
       </w:r>
       <w:proofErr w:type="spellStart"/>
       <w:r>
@@ -1564,9 +1707,9 @@
     <w:p/>
     <w:p>
       <w:pPr>
-        <w:pStyle w:val="Heading1"/>
-      </w:pPr>
-      <w:bookmarkStart w:name="_Toc241693220" w:id="7"/>
+        <w:pStyle w:val="berschrift1"/>
+      </w:pPr>
+      <w:bookmarkStart w:id="7" w:name="_Toc244078664"/>
       <w:r>
         <w:t>23</w:t>
       </w:r>
@@ -1711,9 +1854,9 @@
     </w:p>
     <w:p>
       <w:pPr>
-        <w:pStyle w:val="Heading1"/>
-      </w:pPr>
-      <w:bookmarkStart w:name="_Toc241693221" w:id="8"/>
+        <w:pStyle w:val="berschrift1"/>
+      </w:pPr>
+      <w:bookmarkStart w:id="8" w:name="_Toc244078665"/>
       <w:r>
         <w:t xml:space="preserve">30.09.2026 </w:t>
       </w:r>
@@ -1807,6 +1950,7 @@
     </w:p>
     <w:p>
       <w:r>
+        <w:lastRenderedPageBreak/>
         <w:t xml:space="preserve">In jedem der drei Projekte hat dann jeder auf seinen eigenen Branch gewechselt, eine Textdatei mit dem eigenen Namen erstellt. </w:t>
       </w:r>
     </w:p>
@@ -1858,13 +2002,138 @@
         <w:t xml:space="preserve">. Ich habe heute gelernt, wie wichtig eine gute Absprache in der Gruppe ist und wie man Projekte für andere freigibt und gemeinsam daran arbeitet. </w:t>
       </w:r>
     </w:p>
+    <w:p/>
+    <w:p>
+      <w:pPr>
+        <w:pStyle w:val="berschrift1"/>
+      </w:pPr>
+      <w:bookmarkStart w:id="9" w:name="_Toc244078666"/>
+      <w:r>
+        <w:t>07.10.2026 Logische Operatoren &amp; Logikgatter</w:t>
+      </w:r>
+      <w:bookmarkEnd w:id="9"/>
+    </w:p>
+    <w:p>
+      <w:r>
+        <w:t xml:space="preserve">Heute haben wir im Unterricht vor den Ferien das Thema Logikgatter und logische Operatoren angeschaut. Dafür haben wir hauptsächlich auf der Online-Plattform </w:t>
+      </w:r>
+      <w:hyperlink r:id="rId11" w:tgtFrame="_blank" w:history="1">
+        <w:r>
+          <w:rPr>
+            <w:rStyle w:val="Hyperlink"/>
+          </w:rPr>
+          <w:t>logic.ly/</w:t>
+        </w:r>
+        <w:proofErr w:type="spellStart"/>
+        <w:r>
+          <w:rPr>
+            <w:rStyle w:val="Hyperlink"/>
+          </w:rPr>
+          <w:t>demo</w:t>
+        </w:r>
+        <w:proofErr w:type="spellEnd"/>
+      </w:hyperlink>
+      <w:r>
+        <w:t xml:space="preserve"> gearbeitet. Zuerst haben wir gelernt, wie die Funktionsweise von Logikgattern wie AND, OR, XOR und NOT aufgebaut ist und wie man die dazugehörigen Wahrheitstabellen liest und versteht. </w:t>
+      </w:r>
+    </w:p>
+    <w:p>
+      <w:r>
+        <w:t>Danach ging es direkt an die Praxis</w:t>
+      </w:r>
+      <w:r>
+        <w:t>.</w:t>
+      </w:r>
+      <w:r>
+        <w:t xml:space="preserve"> Auf der Website haben wir verschiedene Logik-Rätsel gelöst, indem wir Schalter, Gatter und Lampen miteinander verdrahtet haben. Zum Beispiel mussten wir Schaltungen bauen, bei denen das Licht nur unter ganz bestimmten Bedingungen anging </w:t>
+      </w:r>
+      <w:r>
+        <w:t>,</w:t>
+      </w:r>
+      <w:r>
+        <w:t xml:space="preserve"> wie etwa eine Schloss-Schaltung mit einem speziellen Secret-Schalter.</w:t>
+      </w:r>
+      <w:r>
+        <w:t xml:space="preserve"> Wir haben aber auch </w:t>
+      </w:r>
+      <w:r>
+        <w:t xml:space="preserve">noch unsere Lernerfahrung und allgemein die Schule besprochen. </w:t>
+      </w:r>
+    </w:p>
+    <w:p/>
+    <w:p>
+      <w:pPr>
+        <w:pStyle w:val="berschrift1"/>
+      </w:pPr>
+      <w:bookmarkStart w:id="10" w:name="_Toc244078667"/>
+      <w:r>
+        <w:t>28.10.2026 Aufgaben Logische Operatoren</w:t>
+      </w:r>
+      <w:bookmarkEnd w:id="10"/>
+    </w:p>
+    <w:p>
+      <w:r>
+        <w:t xml:space="preserve">Nach den Ferien haben wir direkt mit einem Quiz gestartet wo wir getestet wurden, </w:t>
+      </w:r>
+      <w:r>
+        <w:t xml:space="preserve">ob und was wir noch so </w:t>
+      </w:r>
+      <w:r>
+        <w:t>behalten,</w:t>
+      </w:r>
+      <w:r>
+        <w:t xml:space="preserve"> haben über die Ferien. Der Start ging mir relativ gut der Fragen gegen Ende des Quiz hingegen wusste ich nicht mehr alles. </w:t>
+      </w:r>
+      <w:r>
+        <w:t xml:space="preserve">Danach haben wir uns an eine weitere </w:t>
+      </w:r>
+      <w:r>
+        <w:t>L</w:t>
+      </w:r>
+      <w:r>
+        <w:t>ogicly Aufgabe gemacht</w:t>
+      </w:r>
+      <w:r>
+        <w:t>, welche von Ernest erstellt worden war. Im Anschluss bekamen wir Zeit die Aufgaben in Intel</w:t>
+      </w:r>
+      <w:r>
+        <w:t>l</w:t>
+      </w:r>
+      <w:r>
+        <w:t>i</w:t>
+      </w:r>
+      <w:r>
+        <w:t xml:space="preserve">j zu lösen zu genau denen Operatoren. Ich hatte einige Schwierigkeiten wieder in Java zu starten nach den Ferien und musste deshalb ein paar Dinge nachschauen. </w:t>
+      </w:r>
+      <w:r>
+        <w:t>Im Großen und Ganzen</w:t>
+      </w:r>
+      <w:r>
+        <w:t xml:space="preserve"> habe ich die Aufgaben aber gut lösen </w:t>
+      </w:r>
+      <w:proofErr w:type="gramStart"/>
+      <w:r>
+        <w:t>können</w:t>
+      </w:r>
+      <w:proofErr w:type="gramEnd"/>
+      <w:r>
+        <w:t xml:space="preserve"> auch wenn für mich das Level gestiegen ist im Vergleich zum Anfang.</w:t>
+      </w:r>
+    </w:p>
+    <w:p/>
+    <w:p/>
+    <w:p/>
+    <w:p/>
+    <w:p/>
+    <w:p/>
+    <w:p/>
     <w:p/>
     <w:p/>
     <w:p/>
     <w:p/>
     <w:p/>
     <w:sectPr>
-      <w:pgSz w:w="11906" w:h="16838" w:orient="portrait"/>
+      <w:pgSz w:w="11906" w:h="16838"/>
       <w:pgMar w:top="1417" w:right="1417" w:bottom="1134" w:left="1417" w:header="708" w:footer="708" w:gutter="0"/>
       <w:cols w:space="708"/>
       <w:docGrid w:linePitch="360"/>
@@ -1891,7 +2160,7 @@
         <w:ind w:left="720" w:hanging="360"/>
       </w:pPr>
       <w:rPr>
-        <w:rFonts w:hint="default" w:ascii="Symbol" w:hAnsi="Symbol"/>
+        <w:rFonts w:ascii="Symbol" w:hAnsi="Symbol" w:hint="default"/>
         <w:sz w:val="20"/>
       </w:rPr>
     </w:lvl>
@@ -1907,7 +2176,7 @@
         <w:ind w:left="1440" w:hanging="360"/>
       </w:pPr>
       <w:rPr>
-        <w:rFonts w:hint="default" w:ascii="Courier New" w:hAnsi="Courier New"/>
+        <w:rFonts w:ascii="Courier New" w:hAnsi="Courier New" w:hint="default"/>
         <w:sz w:val="20"/>
       </w:rPr>
     </w:lvl>
@@ -1923,7 +2192,7 @@
         <w:ind w:left="2160" w:hanging="360"/>
       </w:pPr>
       <w:rPr>
-        <w:rFonts w:hint="default" w:ascii="Wingdings" w:hAnsi="Wingdings"/>
+        <w:rFonts w:ascii="Wingdings" w:hAnsi="Wingdings" w:hint="default"/>
         <w:sz w:val="20"/>
       </w:rPr>
     </w:lvl>
@@ -1939,7 +2208,7 @@
         <w:ind w:left="2880" w:hanging="360"/>
       </w:pPr>
       <w:rPr>
-        <w:rFonts w:hint="default" w:ascii="Wingdings" w:hAnsi="Wingdings"/>
+        <w:rFonts w:ascii="Wingdings" w:hAnsi="Wingdings" w:hint="default"/>
         <w:sz w:val="20"/>
       </w:rPr>
     </w:lvl>
@@ -1955,7 +2224,7 @@
         <w:ind w:left="3600" w:hanging="360"/>
       </w:pPr>
       <w:rPr>
-        <w:rFonts w:hint="default" w:ascii="Wingdings" w:hAnsi="Wingdings"/>
+        <w:rFonts w:ascii="Wingdings" w:hAnsi="Wingdings" w:hint="default"/>
         <w:sz w:val="20"/>
       </w:rPr>
     </w:lvl>
@@ -1971,7 +2240,7 @@
         <w:ind w:left="4320" w:hanging="360"/>
       </w:pPr>
       <w:rPr>
-        <w:rFonts w:hint="default" w:ascii="Wingdings" w:hAnsi="Wingdings"/>
+        <w:rFonts w:ascii="Wingdings" w:hAnsi="Wingdings" w:hint="default"/>
         <w:sz w:val="20"/>
       </w:rPr>
     </w:lvl>
@@ -1987,7 +2256,7 @@
         <w:ind w:left="5040" w:hanging="360"/>
       </w:pPr>
       <w:rPr>
-        <w:rFonts w:hint="default" w:ascii="Wingdings" w:hAnsi="Wingdings"/>
+        <w:rFonts w:ascii="Wingdings" w:hAnsi="Wingdings" w:hint="default"/>
         <w:sz w:val="20"/>
       </w:rPr>
     </w:lvl>
@@ -2003,7 +2272,7 @@
         <w:ind w:left="5760" w:hanging="360"/>
       </w:pPr>
       <w:rPr>
-        <w:rFonts w:hint="default" w:ascii="Wingdings" w:hAnsi="Wingdings"/>
+        <w:rFonts w:ascii="Wingdings" w:hAnsi="Wingdings" w:hint="default"/>
         <w:sz w:val="20"/>
       </w:rPr>
     </w:lvl>
@@ -2019,7 +2288,7 @@
         <w:ind w:left="6480" w:hanging="360"/>
       </w:pPr>
       <w:rPr>
-        <w:rFonts w:hint="default" w:ascii="Wingdings" w:hAnsi="Wingdings"/>
+        <w:rFonts w:ascii="Wingdings" w:hAnsi="Wingdings" w:hint="default"/>
         <w:sz w:val="20"/>
       </w:rPr>
     </w:lvl>
@@ -2040,7 +2309,7 @@
         <w:ind w:left="720" w:hanging="360"/>
       </w:pPr>
       <w:rPr>
-        <w:rFonts w:hint="default" w:ascii="Symbol" w:hAnsi="Symbol"/>
+        <w:rFonts w:ascii="Symbol" w:hAnsi="Symbol" w:hint="default"/>
         <w:sz w:val="20"/>
       </w:rPr>
     </w:lvl>
@@ -2056,7 +2325,7 @@
         <w:ind w:left="1440" w:hanging="360"/>
       </w:pPr>
       <w:rPr>
-        <w:rFonts w:hint="default" w:ascii="Courier New" w:hAnsi="Courier New"/>
+        <w:rFonts w:ascii="Courier New" w:hAnsi="Courier New" w:hint="default"/>
         <w:sz w:val="20"/>
       </w:rPr>
     </w:lvl>
@@ -2072,7 +2341,7 @@
         <w:ind w:left="2160" w:hanging="360"/>
       </w:pPr>
       <w:rPr>
-        <w:rFonts w:hint="default" w:ascii="Wingdings" w:hAnsi="Wingdings"/>
+        <w:rFonts w:ascii="Wingdings" w:hAnsi="Wingdings" w:hint="default"/>
         <w:sz w:val="20"/>
       </w:rPr>
     </w:lvl>
@@ -2088,7 +2357,7 @@
         <w:ind w:left="2880" w:hanging="360"/>
       </w:pPr>
       <w:rPr>
-        <w:rFonts w:hint="default" w:ascii="Wingdings" w:hAnsi="Wingdings"/>
+        <w:rFonts w:ascii="Wingdings" w:hAnsi="Wingdings" w:hint="default"/>
         <w:sz w:val="20"/>
       </w:rPr>
     </w:lvl>
@@ -2104,7 +2373,7 @@
         <w:ind w:left="3600" w:hanging="360"/>
       </w:pPr>
       <w:rPr>
-        <w:rFonts w:hint="default" w:ascii="Wingdings" w:hAnsi="Wingdings"/>
+        <w:rFonts w:ascii="Wingdings" w:hAnsi="Wingdings" w:hint="default"/>
         <w:sz w:val="20"/>
       </w:rPr>
     </w:lvl>
@@ -2120,7 +2389,7 @@
         <w:ind w:left="4320" w:hanging="360"/>
       </w:pPr>
       <w:rPr>
-        <w:rFonts w:hint="default" w:ascii="Wingdings" w:hAnsi="Wingdings"/>
+        <w:rFonts w:ascii="Wingdings" w:hAnsi="Wingdings" w:hint="default"/>
         <w:sz w:val="20"/>
       </w:rPr>
     </w:lvl>
@@ -2136,7 +2405,7 @@
         <w:ind w:left="5040" w:hanging="360"/>
       </w:pPr>
       <w:rPr>
-        <w:rFonts w:hint="default" w:ascii="Wingdings" w:hAnsi="Wingdings"/>
+        <w:rFonts w:ascii="Wingdings" w:hAnsi="Wingdings" w:hint="default"/>
         <w:sz w:val="20"/>
       </w:rPr>
     </w:lvl>
@@ -2152,7 +2421,7 @@
         <w:ind w:left="5760" w:hanging="360"/>
       </w:pPr>
       <w:rPr>
-        <w:rFonts w:hint="default" w:ascii="Wingdings" w:hAnsi="Wingdings"/>
+        <w:rFonts w:ascii="Wingdings" w:hAnsi="Wingdings" w:hint="default"/>
         <w:sz w:val="20"/>
       </w:rPr>
     </w:lvl>
@@ -2168,7 +2437,7 @@
         <w:ind w:left="6480" w:hanging="360"/>
       </w:pPr>
       <w:rPr>
-        <w:rFonts w:hint="default" w:ascii="Wingdings" w:hAnsi="Wingdings"/>
+        <w:rFonts w:ascii="Wingdings" w:hAnsi="Wingdings" w:hint="default"/>
         <w:sz w:val="20"/>
       </w:rPr>
     </w:lvl>
@@ -2187,7 +2456,7 @@
   <w:docDefaults>
     <w:rPrDefault>
       <w:rPr>
-        <w:rFonts w:asciiTheme="minorHAnsi" w:hAnsiTheme="minorHAnsi" w:eastAsiaTheme="minorHAnsi" w:cstheme="minorBidi"/>
+        <w:rFonts w:asciiTheme="minorHAnsi" w:eastAsiaTheme="minorHAnsi" w:hAnsiTheme="minorHAnsi" w:cstheme="minorBidi"/>
         <w:kern w:val="2"/>
         <w:sz w:val="24"/>
         <w:szCs w:val="24"/>
@@ -2204,14 +2473,14 @@
   <w:latentStyles w:defLockedState="0" w:defUIPriority="99" w:defSemiHidden="0" w:defUnhideWhenUsed="0" w:defQFormat="0" w:count="376">
     <w:lsdException w:name="Normal" w:uiPriority="0" w:qFormat="1"/>
     <w:lsdException w:name="heading 1" w:uiPriority="9" w:qFormat="1"/>
-    <w:lsdException w:name="heading 2" w:uiPriority="9" w:semiHidden="1" w:unhideWhenUsed="1" w:qFormat="1"/>
-    <w:lsdException w:name="heading 3" w:uiPriority="9" w:semiHidden="1" w:unhideWhenUsed="1" w:qFormat="1"/>
-    <w:lsdException w:name="heading 4" w:uiPriority="9" w:semiHidden="1" w:unhideWhenUsed="1" w:qFormat="1"/>
-    <w:lsdException w:name="heading 5" w:uiPriority="9" w:semiHidden="1" w:unhideWhenUsed="1" w:qFormat="1"/>
-    <w:lsdException w:name="heading 6" w:uiPriority="9" w:semiHidden="1" w:unhideWhenUsed="1" w:qFormat="1"/>
-    <w:lsdException w:name="heading 7" w:uiPriority="9" w:semiHidden="1" w:unhideWhenUsed="1" w:qFormat="1"/>
-    <w:lsdException w:name="heading 8" w:uiPriority="9" w:semiHidden="1" w:unhideWhenUsed="1" w:qFormat="1"/>
-    <w:lsdException w:name="heading 9" w:uiPriority="9" w:semiHidden="1" w:unhideWhenUsed="1" w:qFormat="1"/>
+    <w:lsdException w:name="heading 2" w:semiHidden="1" w:uiPriority="9" w:unhideWhenUsed="1" w:qFormat="1"/>
+    <w:lsdException w:name="heading 3" w:semiHidden="1" w:uiPriority="9" w:unhideWhenUsed="1" w:qFormat="1"/>
+    <w:lsdException w:name="heading 4" w:semiHidden="1" w:uiPriority="9" w:unhideWhenUsed="1" w:qFormat="1"/>
+    <w:lsdException w:name="heading 5" w:semiHidden="1" w:uiPriority="9" w:unhideWhenUsed="1" w:qFormat="1"/>
+    <w:lsdException w:name="heading 6" w:semiHidden="1" w:uiPriority="9" w:unhideWhenUsed="1" w:qFormat="1"/>
+    <w:lsdException w:name="heading 7" w:semiHidden="1" w:uiPriority="9" w:unhideWhenUsed="1" w:qFormat="1"/>
+    <w:lsdException w:name="heading 8" w:semiHidden="1" w:uiPriority="9" w:unhideWhenUsed="1" w:qFormat="1"/>
+    <w:lsdException w:name="heading 9" w:semiHidden="1" w:uiPriority="9" w:unhideWhenUsed="1" w:qFormat="1"/>
     <w:lsdException w:name="index 1" w:semiHidden="1" w:unhideWhenUsed="1"/>
     <w:lsdException w:name="index 2" w:semiHidden="1" w:unhideWhenUsed="1"/>
     <w:lsdException w:name="index 3" w:semiHidden="1" w:unhideWhenUsed="1"/>
@@ -2221,22 +2490,22 @@
     <w:lsdException w:name="index 7" w:semiHidden="1" w:unhideWhenUsed="1"/>
     <w:lsdException w:name="index 8" w:semiHidden="1" w:unhideWhenUsed="1"/>
     <w:lsdException w:name="index 9" w:semiHidden="1" w:unhideWhenUsed="1"/>
-    <w:lsdException w:name="toc 1" w:uiPriority="39" w:semiHidden="1" w:unhideWhenUsed="1"/>
-    <w:lsdException w:name="toc 2" w:uiPriority="39" w:semiHidden="1" w:unhideWhenUsed="1"/>
-    <w:lsdException w:name="toc 3" w:uiPriority="39" w:semiHidden="1" w:unhideWhenUsed="1"/>
-    <w:lsdException w:name="toc 4" w:uiPriority="39" w:semiHidden="1" w:unhideWhenUsed="1"/>
-    <w:lsdException w:name="toc 5" w:uiPriority="39" w:semiHidden="1" w:unhideWhenUsed="1"/>
-    <w:lsdException w:name="toc 6" w:uiPriority="39" w:semiHidden="1" w:unhideWhenUsed="1"/>
-    <w:lsdException w:name="toc 7" w:uiPriority="39" w:semiHidden="1" w:unhideWhenUsed="1"/>
-    <w:lsdException w:name="toc 8" w:uiPriority="39" w:semiHidden="1" w:unhideWhenUsed="1"/>
-    <w:lsdException w:name="toc 9" w:uiPriority="39" w:semiHidden="1" w:unhideWhenUsed="1"/>
+    <w:lsdException w:name="toc 1" w:semiHidden="1" w:uiPriority="39" w:unhideWhenUsed="1"/>
+    <w:lsdException w:name="toc 2" w:semiHidden="1" w:uiPriority="39" w:unhideWhenUsed="1"/>
+    <w:lsdException w:name="toc 3" w:semiHidden="1" w:uiPriority="39" w:unhideWhenUsed="1"/>
+    <w:lsdException w:name="toc 4" w:semiHidden="1" w:uiPriority="39" w:unhideWhenUsed="1"/>
+    <w:lsdException w:name="toc 5" w:semiHidden="1" w:uiPriority="39" w:unhideWhenUsed="1"/>
+    <w:lsdException w:name="toc 6" w:semiHidden="1" w:uiPriority="39" w:unhideWhenUsed="1"/>
+    <w:lsdException w:name="toc 7" w:semiHidden="1" w:uiPriority="39" w:unhideWhenUsed="1"/>
+    <w:lsdException w:name="toc 8" w:semiHidden="1" w:uiPriority="39" w:unhideWhenUsed="1"/>
+    <w:lsdException w:name="toc 9" w:semiHidden="1" w:uiPriority="39" w:unhideWhenUsed="1"/>
     <w:lsdException w:name="Normal Indent" w:semiHidden="1" w:unhideWhenUsed="1"/>
     <w:lsdException w:name="footnote text" w:semiHidden="1" w:unhideWhenUsed="1"/>
     <w:lsdException w:name="annotation text" w:semiHidden="1" w:unhideWhenUsed="1"/>
     <w:lsdException w:name="header" w:semiHidden="1" w:unhideWhenUsed="1"/>
     <w:lsdException w:name="footer" w:semiHidden="1" w:unhideWhenUsed="1"/>
     <w:lsdException w:name="index heading" w:semiHidden="1" w:unhideWhenUsed="1"/>
-    <w:lsdException w:name="caption" w:uiPriority="35" w:semiHidden="1" w:unhideWhenUsed="1" w:qFormat="1"/>
+    <w:lsdException w:name="caption" w:semiHidden="1" w:uiPriority="35" w:unhideWhenUsed="1" w:qFormat="1"/>
     <w:lsdException w:name="table of figures" w:semiHidden="1" w:unhideWhenUsed="1"/>
     <w:lsdException w:name="envelope address" w:semiHidden="1" w:unhideWhenUsed="1"/>
     <w:lsdException w:name="envelope return" w:semiHidden="1" w:unhideWhenUsed="1"/>
@@ -2267,7 +2536,7 @@
     <w:lsdException w:name="Title" w:uiPriority="10" w:qFormat="1"/>
     <w:lsdException w:name="Closing" w:semiHidden="1" w:unhideWhenUsed="1"/>
     <w:lsdException w:name="Signature" w:semiHidden="1" w:unhideWhenUsed="1"/>
-    <w:lsdException w:name="Default Paragraph Font" w:uiPriority="1" w:semiHidden="1" w:unhideWhenUsed="1"/>
+    <w:lsdException w:name="Default Paragraph Font" w:semiHidden="1" w:uiPriority="1" w:unhideWhenUsed="1"/>
     <w:lsdException w:name="Body Text" w:semiHidden="1" w:unhideWhenUsed="1"/>
     <w:lsdException w:name="Body Text Indent" w:semiHidden="1" w:unhideWhenUsed="1"/>
     <w:lsdException w:name="List Continue" w:semiHidden="1" w:unhideWhenUsed="1"/>
@@ -2467,8 +2736,8 @@
     <w:lsdException w:name="Subtle Reference" w:uiPriority="31" w:qFormat="1"/>
     <w:lsdException w:name="Intense Reference" w:uiPriority="32" w:qFormat="1"/>
     <w:lsdException w:name="Book Title" w:uiPriority="33" w:qFormat="1"/>
-    <w:lsdException w:name="Bibliography" w:uiPriority="37" w:semiHidden="1" w:unhideWhenUsed="1"/>
-    <w:lsdException w:name="TOC Heading" w:uiPriority="39" w:semiHidden="1" w:unhideWhenUsed="1" w:qFormat="1"/>
+    <w:lsdException w:name="Bibliography" w:semiHidden="1" w:uiPriority="37" w:unhideWhenUsed="1"/>
+    <w:lsdException w:name="TOC Heading" w:semiHidden="1" w:uiPriority="39" w:unhideWhenUsed="1" w:qFormat="1"/>
     <w:lsdException w:name="Plain Table 1" w:uiPriority="41"/>
     <w:lsdException w:name="Plain Table 2" w:uiPriority="42"/>
     <w:lsdException w:name="Plain Table 3" w:uiPriority="43"/>
@@ -2579,15 +2848,15 @@
     <w:lsdException w:name="Unresolved Mention" w:semiHidden="1" w:unhideWhenUsed="1"/>
     <w:lsdException w:name="Smart Link" w:semiHidden="1" w:unhideWhenUsed="1"/>
   </w:latentStyles>
-  <w:style w:type="paragraph" w:styleId="Normal" w:default="1">
+  <w:style w:type="paragraph" w:default="1" w:styleId="Standard">
     <w:name w:val="Normal"/>
     <w:qFormat/>
   </w:style>
-  <w:style w:type="paragraph" w:styleId="Heading1">
+  <w:style w:type="paragraph" w:styleId="berschrift1">
     <w:name w:val="heading 1"/>
-    <w:basedOn w:val="Normal"/>
-    <w:next w:val="Normal"/>
-    <w:link w:val="Heading1Char"/>
+    <w:basedOn w:val="Standard"/>
+    <w:next w:val="Standard"/>
+    <w:link w:val="berschrift1Zchn"/>
     <w:uiPriority w:val="9"/>
     <w:qFormat/>
     <w:rsid w:val="00BB08D7"/>
@@ -2598,17 +2867,17 @@
       <w:outlineLvl w:val="0"/>
     </w:pPr>
     <w:rPr>
-      <w:rFonts w:asciiTheme="majorHAnsi" w:hAnsiTheme="majorHAnsi" w:eastAsiaTheme="majorEastAsia" w:cstheme="majorBidi"/>
+      <w:rFonts w:asciiTheme="majorHAnsi" w:eastAsiaTheme="majorEastAsia" w:hAnsiTheme="majorHAnsi" w:cstheme="majorBidi"/>
       <w:color w:val="0F4761" w:themeColor="accent1" w:themeShade="BF"/>
       <w:sz w:val="40"/>
       <w:szCs w:val="40"/>
     </w:rPr>
   </w:style>
-  <w:style w:type="paragraph" w:styleId="Heading2">
+  <w:style w:type="paragraph" w:styleId="berschrift2">
     <w:name w:val="heading 2"/>
-    <w:basedOn w:val="Normal"/>
-    <w:next w:val="Normal"/>
-    <w:link w:val="Heading2Char"/>
+    <w:basedOn w:val="Standard"/>
+    <w:next w:val="Standard"/>
+    <w:link w:val="berschrift2Zchn"/>
     <w:uiPriority w:val="9"/>
     <w:unhideWhenUsed/>
     <w:qFormat/>
@@ -2620,19 +2889,18 @@
       <w:outlineLvl w:val="1"/>
     </w:pPr>
     <w:rPr>
-      <w:rFonts w:asciiTheme="majorHAnsi" w:hAnsiTheme="majorHAnsi" w:eastAsiaTheme="majorEastAsia" w:cstheme="majorBidi"/>
+      <w:rFonts w:asciiTheme="majorHAnsi" w:eastAsiaTheme="majorEastAsia" w:hAnsiTheme="majorHAnsi" w:cstheme="majorBidi"/>
       <w:color w:val="0F4761" w:themeColor="accent1" w:themeShade="BF"/>
       <w:sz w:val="32"/>
       <w:szCs w:val="32"/>
     </w:rPr>
   </w:style>
-  <w:style w:type="paragraph" w:styleId="Heading3">
+  <w:style w:type="paragraph" w:styleId="berschrift3">
     <w:name w:val="heading 3"/>
-    <w:basedOn w:val="Normal"/>
-    <w:next w:val="Normal"/>
-    <w:link w:val="Heading3Char"/>
+    <w:basedOn w:val="Standard"/>
+    <w:next w:val="Standard"/>
+    <w:link w:val="berschrift3Zchn"/>
     <w:uiPriority w:val="9"/>
-    <w:semiHidden/>
     <w:unhideWhenUsed/>
     <w:qFormat/>
     <w:rsid w:val="00BB08D7"/>
@@ -2649,11 +2917,11 @@
       <w:szCs w:val="28"/>
     </w:rPr>
   </w:style>
-  <w:style w:type="paragraph" w:styleId="Heading4">
+  <w:style w:type="paragraph" w:styleId="berschrift4">
     <w:name w:val="heading 4"/>
-    <w:basedOn w:val="Normal"/>
-    <w:next w:val="Normal"/>
-    <w:link w:val="Heading4Char"/>
+    <w:basedOn w:val="Standard"/>
+    <w:next w:val="Standard"/>
+    <w:link w:val="berschrift4Zchn"/>
     <w:uiPriority w:val="9"/>
     <w:semiHidden/>
     <w:unhideWhenUsed/>
@@ -2672,11 +2940,11 @@
       <w:color w:val="0F4761" w:themeColor="accent1" w:themeShade="BF"/>
     </w:rPr>
   </w:style>
-  <w:style w:type="paragraph" w:styleId="Heading5">
+  <w:style w:type="paragraph" w:styleId="berschrift5">
     <w:name w:val="heading 5"/>
-    <w:basedOn w:val="Normal"/>
-    <w:next w:val="Normal"/>
-    <w:link w:val="Heading5Char"/>
+    <w:basedOn w:val="Standard"/>
+    <w:next w:val="Standard"/>
+    <w:link w:val="berschrift5Zchn"/>
     <w:uiPriority w:val="9"/>
     <w:semiHidden/>
     <w:unhideWhenUsed/>
@@ -2693,11 +2961,11 @@
       <w:color w:val="0F4761" w:themeColor="accent1" w:themeShade="BF"/>
     </w:rPr>
   </w:style>
-  <w:style w:type="paragraph" w:styleId="Heading6">
+  <w:style w:type="paragraph" w:styleId="berschrift6">
     <w:name w:val="heading 6"/>
-    <w:basedOn w:val="Normal"/>
-    <w:next w:val="Normal"/>
-    <w:link w:val="Heading6Char"/>
+    <w:basedOn w:val="Standard"/>
+    <w:next w:val="Standard"/>
+    <w:link w:val="berschrift6Zchn"/>
     <w:uiPriority w:val="9"/>
     <w:semiHidden/>
     <w:unhideWhenUsed/>
@@ -2716,11 +2984,11 @@
       <w:color w:val="595959" w:themeColor="text1" w:themeTint="A6"/>
     </w:rPr>
   </w:style>
-  <w:style w:type="paragraph" w:styleId="Heading7">
+  <w:style w:type="paragraph" w:styleId="berschrift7">
     <w:name w:val="heading 7"/>
-    <w:basedOn w:val="Normal"/>
-    <w:next w:val="Normal"/>
-    <w:link w:val="Heading7Char"/>
+    <w:basedOn w:val="Standard"/>
+    <w:next w:val="Standard"/>
+    <w:link w:val="berschrift7Zchn"/>
     <w:uiPriority w:val="9"/>
     <w:semiHidden/>
     <w:unhideWhenUsed/>
@@ -2737,11 +3005,11 @@
       <w:color w:val="595959" w:themeColor="text1" w:themeTint="A6"/>
     </w:rPr>
   </w:style>
-  <w:style w:type="paragraph" w:styleId="Heading8">
+  <w:style w:type="paragraph" w:styleId="berschrift8">
     <w:name w:val="heading 8"/>
-    <w:basedOn w:val="Normal"/>
-    <w:next w:val="Normal"/>
-    <w:link w:val="Heading8Char"/>
+    <w:basedOn w:val="Standard"/>
+    <w:next w:val="Standard"/>
+    <w:link w:val="berschrift8Zchn"/>
     <w:uiPriority w:val="9"/>
     <w:semiHidden/>
     <w:unhideWhenUsed/>
@@ -2760,11 +3028,11 @@
       <w:color w:val="272727" w:themeColor="text1" w:themeTint="D8"/>
     </w:rPr>
   </w:style>
-  <w:style w:type="paragraph" w:styleId="Heading9">
+  <w:style w:type="paragraph" w:styleId="berschrift9">
     <w:name w:val="heading 9"/>
-    <w:basedOn w:val="Normal"/>
-    <w:next w:val="Normal"/>
-    <w:link w:val="Heading9Char"/>
+    <w:basedOn w:val="Standard"/>
+    <w:next w:val="Standard"/>
+    <w:link w:val="berschrift9Zchn"/>
     <w:uiPriority w:val="9"/>
     <w:semiHidden/>
     <w:unhideWhenUsed/>
@@ -2781,13 +3049,12 @@
       <w:color w:val="272727" w:themeColor="text1" w:themeTint="D8"/>
     </w:rPr>
   </w:style>
-  <w:style w:type="character" w:styleId="DefaultParagraphFont" w:default="1">
+  <w:style w:type="character" w:default="1" w:styleId="Absatz-Standardschriftart">
     <w:name w:val="Default Paragraph Font"/>
     <w:uiPriority w:val="1"/>
-    <w:semiHidden/>
     <w:unhideWhenUsed/>
   </w:style>
-  <w:style w:type="table" w:styleId="TableNormal" w:default="1">
+  <w:style w:type="table" w:default="1" w:styleId="NormaleTabelle">
     <w:name w:val="Normal Table"/>
     <w:uiPriority w:val="99"/>
     <w:semiHidden/>
@@ -2802,44 +3069,43 @@
       </w:tblCellMar>
     </w:tblPr>
   </w:style>
-  <w:style w:type="numbering" w:styleId="NoList" w:default="1">
+  <w:style w:type="numbering" w:default="1" w:styleId="KeineListe">
     <w:name w:val="No List"/>
     <w:uiPriority w:val="99"/>
     <w:semiHidden/>
     <w:unhideWhenUsed/>
   </w:style>
-  <w:style w:type="character" w:styleId="Heading1Char" w:customStyle="1">
-    <w:name w:val="Heading 1 Char"/>
-    <w:basedOn w:val="DefaultParagraphFont"/>
-    <w:link w:val="Heading1"/>
+  <w:style w:type="character" w:customStyle="1" w:styleId="berschrift1Zchn">
+    <w:name w:val="Überschrift 1 Zchn"/>
+    <w:basedOn w:val="Absatz-Standardschriftart"/>
+    <w:link w:val="berschrift1"/>
     <w:uiPriority w:val="9"/>
     <w:rsid w:val="00BB08D7"/>
     <w:rPr>
-      <w:rFonts w:asciiTheme="majorHAnsi" w:hAnsiTheme="majorHAnsi" w:eastAsiaTheme="majorEastAsia" w:cstheme="majorBidi"/>
+      <w:rFonts w:asciiTheme="majorHAnsi" w:eastAsiaTheme="majorEastAsia" w:hAnsiTheme="majorHAnsi" w:cstheme="majorBidi"/>
       <w:color w:val="0F4761" w:themeColor="accent1" w:themeShade="BF"/>
       <w:sz w:val="40"/>
       <w:szCs w:val="40"/>
     </w:rPr>
   </w:style>
-  <w:style w:type="character" w:styleId="Heading2Char" w:customStyle="1">
-    <w:name w:val="Heading 2 Char"/>
-    <w:basedOn w:val="DefaultParagraphFont"/>
-    <w:link w:val="Heading2"/>
+  <w:style w:type="character" w:customStyle="1" w:styleId="berschrift2Zchn">
+    <w:name w:val="Überschrift 2 Zchn"/>
+    <w:basedOn w:val="Absatz-Standardschriftart"/>
+    <w:link w:val="berschrift2"/>
     <w:uiPriority w:val="9"/>
     <w:rsid w:val="00BB08D7"/>
     <w:rPr>
-      <w:rFonts w:asciiTheme="majorHAnsi" w:hAnsiTheme="majorHAnsi" w:eastAsiaTheme="majorEastAsia" w:cstheme="majorBidi"/>
+      <w:rFonts w:asciiTheme="majorHAnsi" w:eastAsiaTheme="majorEastAsia" w:hAnsiTheme="majorHAnsi" w:cstheme="majorBidi"/>
       <w:color w:val="0F4761" w:themeColor="accent1" w:themeShade="BF"/>
       <w:sz w:val="32"/>
       <w:szCs w:val="32"/>
     </w:rPr>
   </w:style>
-  <w:style w:type="character" w:styleId="Heading3Char" w:customStyle="1">
-    <w:name w:val="Heading 3 Char"/>
-    <w:basedOn w:val="DefaultParagraphFont"/>
-    <w:link w:val="Heading3"/>
+  <w:style w:type="character" w:customStyle="1" w:styleId="berschrift3Zchn">
+    <w:name w:val="Überschrift 3 Zchn"/>
+    <w:basedOn w:val="Absatz-Standardschriftart"/>
+    <w:link w:val="berschrift3"/>
     <w:uiPriority w:val="9"/>
-    <w:semiHidden/>
     <w:rsid w:val="00BB08D7"/>
     <w:rPr>
       <w:rFonts w:eastAsiaTheme="majorEastAsia" w:cstheme="majorBidi"/>
@@ -2848,10 +3114,10 @@
       <w:szCs w:val="28"/>
     </w:rPr>
   </w:style>
-  <w:style w:type="character" w:styleId="Heading4Char" w:customStyle="1">
-    <w:name w:val="Heading 4 Char"/>
-    <w:basedOn w:val="DefaultParagraphFont"/>
-    <w:link w:val="Heading4"/>
+  <w:style w:type="character" w:customStyle="1" w:styleId="berschrift4Zchn">
+    <w:name w:val="Überschrift 4 Zchn"/>
+    <w:basedOn w:val="Absatz-Standardschriftart"/>
+    <w:link w:val="berschrift4"/>
     <w:uiPriority w:val="9"/>
     <w:semiHidden/>
     <w:rsid w:val="00BB08D7"/>
@@ -2862,10 +3128,10 @@
       <w:color w:val="0F4761" w:themeColor="accent1" w:themeShade="BF"/>
     </w:rPr>
   </w:style>
-  <w:style w:type="character" w:styleId="Heading5Char" w:customStyle="1">
-    <w:name w:val="Heading 5 Char"/>
-    <w:basedOn w:val="DefaultParagraphFont"/>
-    <w:link w:val="Heading5"/>
+  <w:style w:type="character" w:customStyle="1" w:styleId="berschrift5Zchn">
+    <w:name w:val="Überschrift 5 Zchn"/>
+    <w:basedOn w:val="Absatz-Standardschriftart"/>
+    <w:link w:val="berschrift5"/>
     <w:uiPriority w:val="9"/>
     <w:semiHidden/>
     <w:rsid w:val="00BB08D7"/>
@@ -2874,10 +3140,10 @@
       <w:color w:val="0F4761" w:themeColor="accent1" w:themeShade="BF"/>
     </w:rPr>
   </w:style>
-  <w:style w:type="character" w:styleId="Heading6Char" w:customStyle="1">
-    <w:name w:val="Heading 6 Char"/>
-    <w:basedOn w:val="DefaultParagraphFont"/>
-    <w:link w:val="Heading6"/>
+  <w:style w:type="character" w:customStyle="1" w:styleId="berschrift6Zchn">
+    <w:name w:val="Überschrift 6 Zchn"/>
+    <w:basedOn w:val="Absatz-Standardschriftart"/>
+    <w:link w:val="berschrift6"/>
     <w:uiPriority w:val="9"/>
     <w:semiHidden/>
     <w:rsid w:val="00BB08D7"/>
@@ -2888,10 +3154,10 @@
       <w:color w:val="595959" w:themeColor="text1" w:themeTint="A6"/>
     </w:rPr>
   </w:style>
-  <w:style w:type="character" w:styleId="Heading7Char" w:customStyle="1">
-    <w:name w:val="Heading 7 Char"/>
-    <w:basedOn w:val="DefaultParagraphFont"/>
-    <w:link w:val="Heading7"/>
+  <w:style w:type="character" w:customStyle="1" w:styleId="berschrift7Zchn">
+    <w:name w:val="Überschrift 7 Zchn"/>
+    <w:basedOn w:val="Absatz-Standardschriftart"/>
+    <w:link w:val="berschrift7"/>
     <w:uiPriority w:val="9"/>
     <w:semiHidden/>
     <w:rsid w:val="00BB08D7"/>
@@ -2900,10 +3166,10 @@
       <w:color w:val="595959" w:themeColor="text1" w:themeTint="A6"/>
     </w:rPr>
   </w:style>
-  <w:style w:type="character" w:styleId="Heading8Char" w:customStyle="1">
-    <w:name w:val="Heading 8 Char"/>
-    <w:basedOn w:val="DefaultParagraphFont"/>
-    <w:link w:val="Heading8"/>
+  <w:style w:type="character" w:customStyle="1" w:styleId="berschrift8Zchn">
+    <w:name w:val="Überschrift 8 Zchn"/>
+    <w:basedOn w:val="Absatz-Standardschriftart"/>
+    <w:link w:val="berschrift8"/>
     <w:uiPriority w:val="9"/>
     <w:semiHidden/>
     <w:rsid w:val="00BB08D7"/>
@@ -2914,10 +3180,10 @@
       <w:color w:val="272727" w:themeColor="text1" w:themeTint="D8"/>
     </w:rPr>
   </w:style>
-  <w:style w:type="character" w:styleId="Heading9Char" w:customStyle="1">
-    <w:name w:val="Heading 9 Char"/>
-    <w:basedOn w:val="DefaultParagraphFont"/>
-    <w:link w:val="Heading9"/>
+  <w:style w:type="character" w:customStyle="1" w:styleId="berschrift9Zchn">
+    <w:name w:val="Überschrift 9 Zchn"/>
+    <w:basedOn w:val="Absatz-Standardschriftart"/>
+    <w:link w:val="berschrift9"/>
     <w:uiPriority w:val="9"/>
     <w:semiHidden/>
     <w:rsid w:val="00BB08D7"/>
@@ -2926,11 +3192,11 @@
       <w:color w:val="272727" w:themeColor="text1" w:themeTint="D8"/>
     </w:rPr>
   </w:style>
-  <w:style w:type="paragraph" w:styleId="Title">
+  <w:style w:type="paragraph" w:styleId="Titel">
     <w:name w:val="Title"/>
-    <w:basedOn w:val="Normal"/>
-    <w:next w:val="Normal"/>
-    <w:link w:val="TitleChar"/>
+    <w:basedOn w:val="Standard"/>
+    <w:next w:val="Standard"/>
+    <w:link w:val="TitelZchn"/>
     <w:uiPriority w:val="10"/>
     <w:qFormat/>
     <w:rsid w:val="00BB08D7"/>
@@ -2939,32 +3205,32 @@
       <w:contextualSpacing/>
     </w:pPr>
     <w:rPr>
-      <w:rFonts w:asciiTheme="majorHAnsi" w:hAnsiTheme="majorHAnsi" w:eastAsiaTheme="majorEastAsia" w:cstheme="majorBidi"/>
+      <w:rFonts w:asciiTheme="majorHAnsi" w:eastAsiaTheme="majorEastAsia" w:hAnsiTheme="majorHAnsi" w:cstheme="majorBidi"/>
       <w:spacing w:val="-10"/>
       <w:kern w:val="28"/>
       <w:sz w:val="56"/>
       <w:szCs w:val="56"/>
     </w:rPr>
   </w:style>
-  <w:style w:type="character" w:styleId="TitleChar" w:customStyle="1">
-    <w:name w:val="Title Char"/>
-    <w:basedOn w:val="DefaultParagraphFont"/>
-    <w:link w:val="Title"/>
+  <w:style w:type="character" w:customStyle="1" w:styleId="TitelZchn">
+    <w:name w:val="Titel Zchn"/>
+    <w:basedOn w:val="Absatz-Standardschriftart"/>
+    <w:link w:val="Titel"/>
     <w:uiPriority w:val="10"/>
     <w:rsid w:val="00BB08D7"/>
     <w:rPr>
-      <w:rFonts w:asciiTheme="majorHAnsi" w:hAnsiTheme="majorHAnsi" w:eastAsiaTheme="majorEastAsia" w:cstheme="majorBidi"/>
+      <w:rFonts w:asciiTheme="majorHAnsi" w:eastAsiaTheme="majorEastAsia" w:hAnsiTheme="majorHAnsi" w:cstheme="majorBidi"/>
       <w:spacing w:val="-10"/>
       <w:kern w:val="28"/>
       <w:sz w:val="56"/>
       <w:szCs w:val="56"/>
     </w:rPr>
   </w:style>
-  <w:style w:type="paragraph" w:styleId="Subtitle">
+  <w:style w:type="paragraph" w:styleId="Untertitel">
     <w:name w:val="Subtitle"/>
-    <w:basedOn w:val="Normal"/>
-    <w:next w:val="Normal"/>
-    <w:link w:val="SubtitleChar"/>
+    <w:basedOn w:val="Standard"/>
+    <w:next w:val="Standard"/>
+    <w:link w:val="UntertitelZchn"/>
     <w:uiPriority w:val="11"/>
     <w:qFormat/>
     <w:rsid w:val="00BB08D7"/>
@@ -2981,10 +3247,10 @@
       <w:szCs w:val="28"/>
     </w:rPr>
   </w:style>
-  <w:style w:type="character" w:styleId="SubtitleChar" w:customStyle="1">
-    <w:name w:val="Subtitle Char"/>
-    <w:basedOn w:val="DefaultParagraphFont"/>
-    <w:link w:val="Subtitle"/>
+  <w:style w:type="character" w:customStyle="1" w:styleId="UntertitelZchn">
+    <w:name w:val="Untertitel Zchn"/>
+    <w:basedOn w:val="Absatz-Standardschriftart"/>
+    <w:link w:val="Untertitel"/>
     <w:uiPriority w:val="11"/>
     <w:rsid w:val="00BB08D7"/>
     <w:rPr>
@@ -2995,11 +3261,11 @@
       <w:szCs w:val="28"/>
     </w:rPr>
   </w:style>
-  <w:style w:type="paragraph" w:styleId="Quote">
+  <w:style w:type="paragraph" w:styleId="Zitat">
     <w:name w:val="Quote"/>
-    <w:basedOn w:val="Normal"/>
-    <w:next w:val="Normal"/>
-    <w:link w:val="QuoteChar"/>
+    <w:basedOn w:val="Standard"/>
+    <w:next w:val="Standard"/>
+    <w:link w:val="ZitatZchn"/>
     <w:uiPriority w:val="29"/>
     <w:qFormat/>
     <w:rsid w:val="00BB08D7"/>
@@ -3013,10 +3279,10 @@
       <w:color w:val="404040" w:themeColor="text1" w:themeTint="BF"/>
     </w:rPr>
   </w:style>
-  <w:style w:type="character" w:styleId="QuoteChar" w:customStyle="1">
-    <w:name w:val="Quote Char"/>
-    <w:basedOn w:val="DefaultParagraphFont"/>
-    <w:link w:val="Quote"/>
+  <w:style w:type="character" w:customStyle="1" w:styleId="ZitatZchn">
+    <w:name w:val="Zitat Zchn"/>
+    <w:basedOn w:val="Absatz-Standardschriftart"/>
+    <w:link w:val="Zitat"/>
     <w:uiPriority w:val="29"/>
     <w:rsid w:val="00BB08D7"/>
     <w:rPr>
@@ -3025,9 +3291,9 @@
       <w:color w:val="404040" w:themeColor="text1" w:themeTint="BF"/>
     </w:rPr>
   </w:style>
-  <w:style w:type="paragraph" w:styleId="ListParagraph">
+  <w:style w:type="paragraph" w:styleId="Listenabsatz">
     <w:name w:val="List Paragraph"/>
-    <w:basedOn w:val="Normal"/>
+    <w:basedOn w:val="Standard"/>
     <w:uiPriority w:val="34"/>
     <w:qFormat/>
     <w:rsid w:val="00BB08D7"/>
@@ -3036,9 +3302,9 @@
       <w:contextualSpacing/>
     </w:pPr>
   </w:style>
-  <w:style w:type="character" w:styleId="IntenseEmphasis">
+  <w:style w:type="character" w:styleId="IntensiveHervorhebung">
     <w:name w:val="Intense Emphasis"/>
-    <w:basedOn w:val="DefaultParagraphFont"/>
+    <w:basedOn w:val="Absatz-Standardschriftart"/>
     <w:uiPriority w:val="21"/>
     <w:qFormat/>
     <w:rsid w:val="00BB08D7"/>
@@ -3048,18 +3314,18 @@
       <w:color w:val="0F4761" w:themeColor="accent1" w:themeShade="BF"/>
     </w:rPr>
   </w:style>
-  <w:style w:type="paragraph" w:styleId="IntenseQuote">
+  <w:style w:type="paragraph" w:styleId="IntensivesZitat">
     <w:name w:val="Intense Quote"/>
-    <w:basedOn w:val="Normal"/>
-    <w:next w:val="Normal"/>
-    <w:link w:val="IntenseQuoteChar"/>
+    <w:basedOn w:val="Standard"/>
+    <w:next w:val="Standard"/>
+    <w:link w:val="IntensivesZitatZchn"/>
     <w:uiPriority w:val="30"/>
     <w:qFormat/>
     <w:rsid w:val="00BB08D7"/>
     <w:pPr>
       <w:pBdr>
-        <w:top w:val="single" w:color="0F4761" w:themeColor="accent1" w:themeShade="BF" w:sz="4" w:space="10"/>
-        <w:bottom w:val="single" w:color="0F4761" w:themeColor="accent1" w:themeShade="BF" w:sz="4" w:space="10"/>
+        <w:top w:val="single" w:sz="4" w:space="10" w:color="0F4761" w:themeColor="accent1" w:themeShade="BF"/>
+        <w:bottom w:val="single" w:sz="4" w:space="10" w:color="0F4761" w:themeColor="accent1" w:themeShade="BF"/>
       </w:pBdr>
       <w:spacing w:before="360" w:after="360"/>
       <w:ind w:left="864" w:right="864"/>
@@ -3071,10 +3337,10 @@
       <w:color w:val="0F4761" w:themeColor="accent1" w:themeShade="BF"/>
     </w:rPr>
   </w:style>
-  <w:style w:type="character" w:styleId="IntenseQuoteChar" w:customStyle="1">
-    <w:name w:val="Intense Quote Char"/>
-    <w:basedOn w:val="DefaultParagraphFont"/>
-    <w:link w:val="IntenseQuote"/>
+  <w:style w:type="character" w:customStyle="1" w:styleId="IntensivesZitatZchn">
+    <w:name w:val="Intensives Zitat Zchn"/>
+    <w:basedOn w:val="Absatz-Standardschriftart"/>
+    <w:link w:val="IntensivesZitat"/>
     <w:uiPriority w:val="30"/>
     <w:rsid w:val="00BB08D7"/>
     <w:rPr>
@@ -3083,9 +3349,9 @@
       <w:color w:val="0F4761" w:themeColor="accent1" w:themeShade="BF"/>
     </w:rPr>
   </w:style>
-  <w:style w:type="character" w:styleId="IntenseReference">
+  <w:style w:type="character" w:styleId="IntensiverVerweis">
     <w:name w:val="Intense Reference"/>
-    <w:basedOn w:val="DefaultParagraphFont"/>
+    <w:basedOn w:val="Absatz-Standardschriftart"/>
     <w:uiPriority w:val="32"/>
     <w:qFormat/>
     <w:rsid w:val="00BB08D7"/>
@@ -3097,10 +3363,10 @@
       <w:spacing w:val="5"/>
     </w:rPr>
   </w:style>
-  <w:style w:type="paragraph" w:styleId="TOCHeading">
+  <w:style w:type="paragraph" w:styleId="Inhaltsverzeichnisberschrift">
     <w:name w:val="TOC Heading"/>
-    <w:basedOn w:val="Heading1"/>
-    <w:next w:val="Normal"/>
+    <w:basedOn w:val="berschrift1"/>
+    <w:next w:val="Standard"/>
     <w:uiPriority w:val="39"/>
     <w:unhideWhenUsed/>
     <w:qFormat/>
@@ -3117,10 +3383,10 @@
       <w14:ligatures w14:val="none"/>
     </w:rPr>
   </w:style>
-  <w:style w:type="paragraph" w:styleId="TOC1">
+  <w:style w:type="paragraph" w:styleId="Verzeichnis1">
     <w:name w:val="toc 1"/>
-    <w:basedOn w:val="Normal"/>
-    <w:next w:val="Normal"/>
+    <w:basedOn w:val="Standard"/>
+    <w:next w:val="Standard"/>
     <w:autoRedefine/>
     <w:uiPriority w:val="39"/>
     <w:unhideWhenUsed/>
@@ -3131,7 +3397,7 @@
   </w:style>
   <w:style w:type="character" w:styleId="Hyperlink">
     <w:name w:val="Hyperlink"/>
-    <w:basedOn w:val="DefaultParagraphFont"/>
+    <w:basedOn w:val="Absatz-Standardschriftart"/>
     <w:uiPriority w:val="99"/>
     <w:unhideWhenUsed/>
     <w:rsid w:val="00677DA8"/>
@@ -3140,10 +3406,10 @@
       <w:u w:val="single"/>
     </w:rPr>
   </w:style>
-  <w:style w:type="paragraph" w:styleId="TOC2">
+  <w:style w:type="paragraph" w:styleId="Verzeichnis2">
     <w:name w:val="toc 2"/>
-    <w:basedOn w:val="Normal"/>
-    <w:next w:val="Normal"/>
+    <w:basedOn w:val="Standard"/>
+    <w:next w:val="Standard"/>
     <w:autoRedefine/>
     <w:uiPriority w:val="39"/>
     <w:unhideWhenUsed/>
@@ -3153,9 +3419,9 @@
       <w:ind w:left="240"/>
     </w:pPr>
   </w:style>
-  <w:style w:type="character" w:styleId="PlaceholderText">
+  <w:style w:type="character" w:styleId="Platzhaltertext">
     <w:name w:val="Placeholder Text"/>
-    <w:basedOn w:val="DefaultParagraphFont"/>
+    <w:basedOn w:val="Absatz-Standardschriftart"/>
     <w:uiPriority w:val="99"/>
     <w:semiHidden/>
     <w:rsid w:val="00840E81"/>
@@ -3163,11 +3429,23 @@
       <w:color w:val="666666"/>
     </w:rPr>
   </w:style>
+  <w:style w:type="character" w:styleId="NichtaufgelsteErwhnung">
+    <w:name w:val="Unresolved Mention"/>
+    <w:basedOn w:val="Absatz-Standardschriftart"/>
+    <w:uiPriority w:val="99"/>
+    <w:semiHidden/>
+    <w:unhideWhenUsed/>
+    <w:rsid w:val="00D8169D"/>
+    <w:rPr>
+      <w:color w:val="605E5C"/>
+      <w:shd w:val="clear" w:color="auto" w:fill="E1DFDD"/>
+    </w:rPr>
+  </w:style>
 </w:styles>
 </file>
 
 <file path=word/theme/theme1.xml><?xml version="1.0" encoding="utf-8"?>
-<a:theme xmlns:a="http://schemas.openxmlformats.org/drawingml/2006/main" xmlns:thm15="http://schemas.microsoft.com/office/thememl/2012/main" name="Office">
+<a:theme xmlns:a="http://schemas.openxmlformats.org/drawingml/2006/main" name="Office">
   <a:themeElements>
     <a:clrScheme name="Office">
       <a:dk1>
@@ -3491,12 +3769,6 @@
 </file>
 
 <file path=customXml/item2.xml><?xml version="1.0" encoding="utf-8"?>
-<p:properties xmlns:p="http://schemas.microsoft.com/office/2006/metadata/properties" xmlns:xsi="http://www.w3.org/2001/XMLSchema-instance" xmlns:pc="http://schemas.microsoft.com/office/infopath/2007/PartnerControls">
-  <documentManagement/>
-</p:properties>
-</file>
-
-<file path=customXml/item3.xml><?xml version="1.0" encoding="utf-8"?>
 <ct:contentTypeSchema xmlns:ct="http://schemas.microsoft.com/office/2006/metadata/contentType" xmlns:ma="http://schemas.microsoft.com/office/2006/metadata/properties/metaAttributes" ct:_="" ma:_="" ma:contentTypeName="Document" ma:contentTypeID="0x010100BCF939945D5AA146941986330541B6BB" ma:contentTypeVersion="4" ma:contentTypeDescription="Crée un document." ma:contentTypeScope="" ma:versionID="4cbf6c4edbe14bdee957b914a035a485">
   <xsd:schema xmlns:xsd="http://www.w3.org/2001/XMLSchema" xmlns:xs="http://www.w3.org/2001/XMLSchema" xmlns:p="http://schemas.microsoft.com/office/2006/metadata/properties" xmlns:ns3="de59af68-80fe-4c59-a874-c4d31861fa54" targetNamespace="http://schemas.microsoft.com/office/2006/metadata/properties" ma:root="true" ma:fieldsID="025506e99647e6a60e640c907d041180" ns3:_="">
     <xsd:import namespace="de59af68-80fe-4c59-a874-c4d31861fa54"/>
@@ -3640,6 +3912,12 @@
 </ct:contentTypeSchema>
 </file>
 
+<file path=customXml/item3.xml><?xml version="1.0" encoding="utf-8"?>
+<p:properties xmlns:p="http://schemas.microsoft.com/office/2006/metadata/properties" xmlns:xsi="http://www.w3.org/2001/XMLSchema-instance" xmlns:pc="http://schemas.microsoft.com/office/infopath/2007/PartnerControls">
+  <documentManagement/>
+</p:properties>
+</file>
+
 <file path=customXml/itemProps1.xml><?xml version="1.0" encoding="utf-8"?>
 <ds:datastoreItem xmlns:ds="http://schemas.openxmlformats.org/officeDocument/2006/customXml" ds:itemID="{5C913B0A-43E8-4A4F-82A7-4C60FBDD5B5E}">
   <ds:schemaRefs>
@@ -3649,15 +3927,6 @@
 </file>
 
 <file path=customXml/itemProps2.xml><?xml version="1.0" encoding="utf-8"?>
-<ds:datastoreItem xmlns:ds="http://schemas.openxmlformats.org/officeDocument/2006/customXml" ds:itemID="{09F33282-EEEB-44A4-8B99-559DA919A2DE}">
-  <ds:schemaRefs>
-    <ds:schemaRef ds:uri="http://schemas.microsoft.com/office/2006/metadata/properties"/>
-    <ds:schemaRef ds:uri="http://schemas.microsoft.com/office/infopath/2007/PartnerControls"/>
-  </ds:schemaRefs>
-</ds:datastoreItem>
-</file>
-
-<file path=customXml/itemProps3.xml><?xml version="1.0" encoding="utf-8"?>
 <ds:datastoreItem xmlns:ds="http://schemas.openxmlformats.org/officeDocument/2006/customXml" ds:itemID="{A91CFBFD-C6A5-4522-A8A2-AB5616F7B60D}">
   <ds:schemaRefs>
     <ds:schemaRef ds:uri="http://schemas.microsoft.com/office/2006/metadata/contentType"/>
@@ -3673,4 +3942,13 @@
     <ds:schemaRef ds:uri="http://schemas.microsoft.com/internal/obd"/>
   </ds:schemaRefs>
 </ds:datastoreItem>
+</file>
+
+<file path=customXml/itemProps3.xml><?xml version="1.0" encoding="utf-8"?>
+<ds:datastoreItem xmlns:ds="http://schemas.openxmlformats.org/officeDocument/2006/customXml" ds:itemID="{09F33282-EEEB-44A4-8B99-559DA919A2DE}">
+  <ds:schemaRefs>
+    <ds:schemaRef ds:uri="http://schemas.microsoft.com/office/2006/metadata/properties"/>
+    <ds:schemaRef ds:uri="http://schemas.microsoft.com/office/infopath/2007/PartnerControls"/>
+  </ds:schemaRefs>
+</ds:datastoreItem>
 </file>
</xml_diff>